<commit_message>
feat: Implement battle system with grid and unit mechanics
</commit_message>
<xml_diff>
--- a/docs/GDD.docx
+++ b/docs/GDD.docx
@@ -1548,7 +1548,7 @@
         <w:rPr>
           <w:rtl w:val="0"/>
         </w:rPr>
-        <w:t xml:space="preserve">Mỗi bên có bàn 3x3, mang tối đa 5 con; thắng khi mọi con bên địch đều bỏ chạy hoặc rơi khỏi sàn.</w:t>
+        <w:t xml:space="preserve">Mỗi bên thường có bàn 3x3, nhưng kích thước có thể thay đổi theo từng trận (ví dụ trận Vua Dế dùng bàn 2x2). Mỗi bên mang tối đa 5 con; thắng khi mọi con bên địch đều bỏ chạy hoặc rơi khỏi sàn.</w:t>
       </w:r>
     </w:p>
     <w:p>
@@ -8075,7 +8075,7 @@
           <w:vertAlign w:val="baseline"/>
           <w:rtl w:val="0"/>
         </w:rPr>
-        <w:t xml:space="preserve">Khi đấu: góc nhìn ngang, bàn 3x3 hơi nghiêng, hai đội đối mặt trái–phải.</w:t>
+        <w:t xml:space="preserve">Khi đấu: góc nhìn ngang, bàn đấu hơi nghiêng, hai đội đối mặt trái–phải.</w:t>
       </w:r>
     </w:p>
     <w:p>
@@ -9180,7 +9180,7 @@
           <w:vertAlign w:val="baseline"/>
           <w:rtl w:val="0"/>
         </w:rPr>
-        <w:t xml:space="preserve"> giữ 2 mảng 3x3; </w:t>
+        <w:t xml:space="preserve"> giữ 2 lưới ô, mặc định 3x3, kích thước đặt theo từng trận; </w:t>
       </w:r>
       <w:r>
         <w:rPr>
@@ -9956,7 +9956,7 @@
           <w:vertAlign w:val="baseline"/>
           <w:rtl w:val="0"/>
         </w:rPr>
-        <w:t xml:space="preserve">☐ Bàn 3x3 hai bên, thanh thứ tự lượt</w:t>
+        <w:t xml:space="preserve">☐ Bàn 3x3 hai bên (kích thước đặt được theo trận), thanh thứ tự lượt</w:t>
       </w:r>
     </w:p>
     <w:p>

</xml_diff>